<commit_message>
update WIS2 GISC Watch Guide build
</commit_message>
<xml_diff>
--- a/gisc-watch-guide/wis2-gisc-watch-guide.docx
+++ b/gisc-watch-guide/wis2-gisc-watch-guide.docx
@@ -33,7 +33,7 @@
         <w:pStyle w:val="Date"/>
       </w:pPr>
       <w:r>
-        <w:t xml:space="preserve">2025-05-26</w:t>
+        <w:t xml:space="preserve">2025-05-27</w:t>
       </w:r>
     </w:p>
     <w:p>
@@ -86,7 +86,7 @@
               <w:jc w:val="left"/>
             </w:pPr>
             <w:r>
-              <w:t xml:space="preserve">Date: 2025-05-26</w:t>
+              <w:t xml:space="preserve">Date: 2025-05-27</w:t>
             </w:r>
           </w:p>
         </w:tc>
@@ -397,7 +397,7 @@
       </w:r>
     </w:p>
     <w:bookmarkEnd w:id="22"/>
-    <w:bookmarkStart w:id="23" w:name="X813d147c553cb791fb00ba256109556ef0203e1"/>
+    <w:bookmarkStart w:id="25" w:name="X813d147c553cb791fb00ba256109556ef0203e1"/>
     <w:p>
       <w:pPr>
         <w:pStyle w:val="Heading1"/>
@@ -463,6 +463,2011 @@
         <w:t xml:space="preserve">The following table shall be filled in, by checking Global Monitoring metrics:</w:t>
       </w:r>
     </w:p>
+    <w:tbl>
+      <w:tblPr>
+        <w:tblStyle w:val="Table"/>
+        <w:tblW w:type="pct" w:w="5000"/>
+        <w:tblLook w:firstRow="1" w:lastRow="0" w:firstColumn="0" w:lastColumn="0" w:noHBand="0" w:noVBand="0" w:val="0020"/>
+        <w:jc w:val="start"/>
+      </w:tblPr>
+      <w:tblGrid>
+        <w:gridCol w:w="1319"/>
+        <w:gridCol w:w="1319"/>
+        <w:gridCol w:w="1319"/>
+        <w:gridCol w:w="1319"/>
+        <w:gridCol w:w="1319"/>
+        <w:gridCol w:w="1320"/>
+      </w:tblGrid>
+      <w:tr>
+        <w:trPr>
+          <w:tblHeader w:val="true"/>
+        </w:trPr>
+        <w:tc>
+          <w:tcPr/>
+          <w:p>
+            <w:pPr>
+              <w:pStyle w:val="Compact"/>
+              <w:jc w:val="left"/>
+            </w:pPr>
+            <w:r>
+              <w:t xml:space="preserve">Global Services</w:t>
+            </w:r>
+          </w:p>
+        </w:tc>
+        <w:tc>
+          <w:tcPr/>
+          <w:p>
+            <w:pPr>
+              <w:pStyle w:val="Compact"/>
+              <w:jc w:val="left"/>
+            </w:pPr>
+            <w:r>
+              <w:t xml:space="preserve">Test Source</w:t>
+            </w:r>
+          </w:p>
+        </w:tc>
+        <w:tc>
+          <w:tcPr/>
+          <w:p>
+            <w:pPr>
+              <w:pStyle w:val="Compact"/>
+              <w:jc w:val="left"/>
+            </w:pPr>
+            <w:r>
+              <w:t xml:space="preserve">Details</w:t>
+            </w:r>
+          </w:p>
+        </w:tc>
+        <w:tc>
+          <w:tcPr/>
+          <w:p>
+            <w:pPr>
+              <w:pStyle w:val="Compact"/>
+              <w:jc w:val="left"/>
+            </w:pPr>
+            <w:r>
+              <w:t xml:space="preserve">Roster Start</w:t>
+            </w:r>
+          </w:p>
+        </w:tc>
+        <w:tc>
+          <w:tcPr/>
+          <w:p>
+            <w:pPr>
+              <w:pStyle w:val="Compact"/>
+              <w:jc w:val="left"/>
+            </w:pPr>
+            <w:r>
+              <w:t xml:space="preserve">Optional additional dates</w:t>
+            </w:r>
+          </w:p>
+        </w:tc>
+        <w:tc>
+          <w:tcPr/>
+          <w:p>
+            <w:pPr>
+              <w:pStyle w:val="Compact"/>
+              <w:jc w:val="left"/>
+            </w:pPr>
+            <w:r>
+              <w:t xml:space="preserve">Roster end</w:t>
+            </w:r>
+          </w:p>
+        </w:tc>
+      </w:tr>
+      <w:tr>
+        <w:tc>
+          <w:tcPr>
+            <w:gridSpan w:val="3"/>
+          </w:tcPr>
+          <w:p>
+            <w:pPr>
+              <w:jc w:val="left"/>
+            </w:pPr>
+            <w:r>
+              <w:rPr>
+                <w:bCs/>
+                <w:b/>
+              </w:rPr>
+              <w:t xml:space="preserve">Global Monitorings</w:t>
+            </w:r>
+          </w:p>
+        </w:tc>
+        <w:tc>
+          <w:tcPr/>
+          <w:p>
+            <w:pPr>
+              <w:jc w:val="left"/>
+            </w:pPr>
+            <w:r>
+              <w:t xml:space="preserve">YYYY/MM/DD</w:t>
+            </w:r>
+          </w:p>
+        </w:tc>
+        <w:tc>
+          <w:tcPr/>
+          <w:p>
+            <w:pPr>
+              <w:jc w:val="left"/>
+            </w:pPr>
+            <w:r>
+              <w:t xml:space="preserve">…​</w:t>
+            </w:r>
+          </w:p>
+        </w:tc>
+        <w:tc>
+          <w:tcPr/>
+          <w:p>
+            <w:pPr>
+              <w:jc w:val="left"/>
+            </w:pPr>
+            <w:r>
+              <w:t xml:space="preserve">YYYY/MM/DD</w:t>
+            </w:r>
+          </w:p>
+        </w:tc>
+      </w:tr>
+      <w:tr>
+        <w:tc>
+          <w:tcPr/>
+          <w:p>
+            <w:pPr>
+              <w:jc w:val="left"/>
+            </w:pPr>
+            <w:r>
+              <w:t xml:space="preserve">GM CMA GISC</w:t>
+            </w:r>
+          </w:p>
+        </w:tc>
+        <w:tc>
+          <w:tcPr/>
+          <w:p>
+            <w:pPr>
+              <w:jc w:val="left"/>
+            </w:pPr>
+            <w:hyperlink r:id="rId23">
+              <w:r>
+                <w:rPr>
+                  <w:rStyle w:val="Hyperlink"/>
+                </w:rPr>
+                <w:t xml:space="preserve">https://gm.wis.cma.cn</w:t>
+              </w:r>
+            </w:hyperlink>
+          </w:p>
+        </w:tc>
+        <w:tc>
+          <w:tcPr/>
+          <w:p>
+            <w:pPr>
+              <w:jc w:val="left"/>
+            </w:pPr>
+            <w:r>
+              <w:t xml:space="preserve">User: gisc_user</w:t>
+            </w:r>
+          </w:p>
+        </w:tc>
+        <w:tc>
+          <w:tcPr/>
+          <w:p>
+            <w:pPr>
+              <w:jc w:val="left"/>
+            </w:pPr>
+            <w:r>
+              <w:t xml:space="preserve">connect OK</w:t>
+            </w:r>
+          </w:p>
+        </w:tc>
+        <w:tc>
+          <w:tcPr/>
+          <w:p>
+            <w:pPr>
+              <w:jc w:val="left"/>
+            </w:pPr>
+            <w:r>
+              <w:t xml:space="preserve">…​</w:t>
+            </w:r>
+          </w:p>
+        </w:tc>
+        <w:tc>
+          <w:tcPr/>
+          <w:p>
+            <w:pPr>
+              <w:jc w:val="left"/>
+            </w:pPr>
+            <w:r>
+              <w:t xml:space="preserve">connect OK</w:t>
+            </w:r>
+          </w:p>
+        </w:tc>
+      </w:tr>
+      <w:tr>
+        <w:tc>
+          <w:tcPr/>
+          <w:p>
+            <w:pPr>
+              <w:jc w:val="left"/>
+            </w:pPr>
+            <w:r>
+              <w:t xml:space="preserve">GM CMA GS</w:t>
+            </w:r>
+          </w:p>
+        </w:tc>
+        <w:tc>
+          <w:tcPr/>
+          <w:p>
+            <w:pPr>
+              <w:jc w:val="left"/>
+            </w:pPr>
+            <w:hyperlink r:id="rId23">
+              <w:r>
+                <w:rPr>
+                  <w:rStyle w:val="Hyperlink"/>
+                </w:rPr>
+                <w:t xml:space="preserve">https://gm.wis.cma.cn</w:t>
+              </w:r>
+            </w:hyperlink>
+          </w:p>
+        </w:tc>
+        <w:tc>
+          <w:tcPr/>
+          <w:p>
+            <w:pPr>
+              <w:jc w:val="left"/>
+            </w:pPr>
+            <w:r>
+              <w:t xml:space="preserve">User: gs_user</w:t>
+            </w:r>
+          </w:p>
+        </w:tc>
+        <w:tc>
+          <w:tcPr/>
+          <w:p>
+            <w:pPr>
+              <w:jc w:val="left"/>
+            </w:pPr>
+            <w:r>
+              <w:t xml:space="preserve">connect OK</w:t>
+            </w:r>
+          </w:p>
+        </w:tc>
+        <w:tc>
+          <w:tcPr/>
+          <w:p>
+            <w:pPr>
+              <w:jc w:val="left"/>
+            </w:pPr>
+            <w:r>
+              <w:t xml:space="preserve">…​</w:t>
+            </w:r>
+          </w:p>
+        </w:tc>
+        <w:tc>
+          <w:tcPr/>
+          <w:p>
+            <w:pPr>
+              <w:jc w:val="left"/>
+            </w:pPr>
+            <w:r>
+              <w:t xml:space="preserve">connect OK</w:t>
+            </w:r>
+          </w:p>
+        </w:tc>
+      </w:tr>
+      <w:tr>
+        <w:tc>
+          <w:tcPr/>
+          <w:p>
+            <w:pPr>
+              <w:jc w:val="left"/>
+            </w:pPr>
+            <w:r>
+              <w:t xml:space="preserve">GM MAROCMETEO GISC</w:t>
+            </w:r>
+          </w:p>
+        </w:tc>
+        <w:tc>
+          <w:tcPr/>
+          <w:p>
+            <w:pPr>
+              <w:jc w:val="left"/>
+            </w:pPr>
+            <w:hyperlink r:id="rId24">
+              <w:r>
+                <w:rPr>
+                  <w:rStyle w:val="Hyperlink"/>
+                </w:rPr>
+                <w:t xml:space="preserve">https://wis2gmc.marocmeteo.ma/</w:t>
+              </w:r>
+            </w:hyperlink>
+          </w:p>
+        </w:tc>
+        <w:tc>
+          <w:tcPr/>
+          <w:p>
+            <w:pPr>
+              <w:jc w:val="left"/>
+            </w:pPr>
+            <w:r>
+              <w:t xml:space="preserve">User: gisc-user</w:t>
+            </w:r>
+          </w:p>
+        </w:tc>
+        <w:tc>
+          <w:tcPr/>
+          <w:p>
+            <w:pPr>
+              <w:jc w:val="left"/>
+            </w:pPr>
+            <w:r>
+              <w:t xml:space="preserve">connect OK</w:t>
+            </w:r>
+          </w:p>
+        </w:tc>
+        <w:tc>
+          <w:tcPr/>
+          <w:p>
+            <w:pPr>
+              <w:jc w:val="left"/>
+            </w:pPr>
+            <w:r>
+              <w:t xml:space="preserve">…​</w:t>
+            </w:r>
+          </w:p>
+        </w:tc>
+        <w:tc>
+          <w:tcPr/>
+          <w:p>
+            <w:pPr>
+              <w:jc w:val="left"/>
+            </w:pPr>
+            <w:r>
+              <w:t xml:space="preserve">connect NOK</w:t>
+            </w:r>
+          </w:p>
+        </w:tc>
+      </w:tr>
+      <w:tr>
+        <w:tc>
+          <w:tcPr>
+            <w:gridSpan w:val="3"/>
+          </w:tcPr>
+          <w:p>
+            <w:pPr>
+              <w:jc w:val="left"/>
+            </w:pPr>
+            <w:r>
+              <w:rPr>
+                <w:bCs/>
+                <w:b/>
+              </w:rPr>
+              <w:t xml:space="preserve">Global Brokers</w:t>
+            </w:r>
+          </w:p>
+        </w:tc>
+        <w:tc>
+          <w:tcPr/>
+          <w:p>
+            <w:pPr>
+              <w:pStyle w:val="Compact"/>
+            </w:pPr>
+          </w:p>
+        </w:tc>
+        <w:tc>
+          <w:tcPr/>
+          <w:p>
+            <w:pPr>
+              <w:pStyle w:val="Compact"/>
+            </w:pPr>
+          </w:p>
+        </w:tc>
+        <w:tc>
+          <w:tcPr/>
+          <w:p>
+            <w:pPr>
+              <w:pStyle w:val="Compact"/>
+            </w:pPr>
+          </w:p>
+        </w:tc>
+      </w:tr>
+      <w:tr>
+        <w:tc>
+          <w:tcPr>
+            <w:gridSpan w:val="3"/>
+          </w:tcPr>
+          <w:p>
+            <w:pPr>
+              <w:jc w:val="left"/>
+            </w:pPr>
+            <w:r>
+              <w:t xml:space="preserve">Based on dashboard</w:t>
+            </w:r>
+            <w:r>
+              <w:t xml:space="preserve"> </w:t>
+            </w:r>
+            <w:r>
+              <w:rPr>
+                <w:bCs/>
+                <w:b/>
+              </w:rPr>
+              <w:t xml:space="preserve">WIS2-GISC/wis2-gisc-GB</w:t>
+            </w:r>
+            <w:r>
+              <w:t xml:space="preserve"> </w:t>
+            </w:r>
+            <w:r>
+              <w:t xml:space="preserve">(gisc_user) / Indicator: "WIS2Nodes Total Messages over past 24h"</w:t>
+            </w:r>
+          </w:p>
+        </w:tc>
+        <w:tc>
+          <w:tcPr/>
+          <w:p>
+            <w:pPr>
+              <w:jc w:val="left"/>
+            </w:pPr>
+            <w:r>
+              <w:t xml:space="preserve">YYYY/MM/DD</w:t>
+            </w:r>
+          </w:p>
+        </w:tc>
+        <w:tc>
+          <w:tcPr/>
+          <w:p>
+            <w:pPr>
+              <w:jc w:val="left"/>
+            </w:pPr>
+            <w:r>
+              <w:t xml:space="preserve">…​</w:t>
+            </w:r>
+          </w:p>
+        </w:tc>
+        <w:tc>
+          <w:tcPr/>
+          <w:p>
+            <w:pPr>
+              <w:jc w:val="left"/>
+            </w:pPr>
+            <w:r>
+              <w:t xml:space="preserve">YYYY/MM/DD</w:t>
+            </w:r>
+          </w:p>
+        </w:tc>
+      </w:tr>
+      <w:tr>
+        <w:tc>
+          <w:tcPr/>
+          <w:p>
+            <w:pPr>
+              <w:jc w:val="left"/>
+            </w:pPr>
+            <w:r>
+              <w:t xml:space="preserve">GB Brazil</w:t>
+            </w:r>
+          </w:p>
+        </w:tc>
+        <w:tc>
+          <w:tcPr>
+            <w:gridSpan w:val="2"/>
+          </w:tcPr>
+          <w:p>
+            <w:pPr>
+              <w:jc w:val="left"/>
+            </w:pPr>
+            <w:r>
+              <w:t xml:space="preserve">From GM China</w:t>
+            </w:r>
+          </w:p>
+        </w:tc>
+        <w:tc>
+          <w:tcPr/>
+          <w:p>
+            <w:pPr>
+              <w:jc w:val="left"/>
+            </w:pPr>
+            <w:r>
+              <w:t xml:space="preserve">63</w:t>
+            </w:r>
+          </w:p>
+        </w:tc>
+        <w:tc>
+          <w:tcPr/>
+          <w:p>
+            <w:pPr>
+              <w:jc w:val="left"/>
+            </w:pPr>
+            <w:r>
+              <w:t xml:space="preserve">…​</w:t>
+            </w:r>
+          </w:p>
+        </w:tc>
+        <w:tc>
+          <w:tcPr/>
+          <w:p>
+            <w:pPr>
+              <w:jc w:val="left"/>
+            </w:pPr>
+            <w:r>
+              <w:t xml:space="preserve">64</w:t>
+            </w:r>
+          </w:p>
+        </w:tc>
+      </w:tr>
+      <w:tr>
+        <w:tc>
+          <w:tcPr/>
+          <w:p>
+            <w:pPr>
+              <w:jc w:val="left"/>
+            </w:pPr>
+            <w:r>
+              <w:t xml:space="preserve">GB Brazil</w:t>
+            </w:r>
+          </w:p>
+        </w:tc>
+        <w:tc>
+          <w:tcPr>
+            <w:gridSpan w:val="2"/>
+          </w:tcPr>
+          <w:p>
+            <w:pPr>
+              <w:jc w:val="left"/>
+            </w:pPr>
+            <w:r>
+              <w:t xml:space="preserve">From GM MAROCMETEA</w:t>
+            </w:r>
+          </w:p>
+        </w:tc>
+        <w:tc>
+          <w:tcPr/>
+          <w:p>
+            <w:pPr>
+              <w:jc w:val="left"/>
+            </w:pPr>
+            <w:r>
+              <w:t xml:space="preserve">63</w:t>
+            </w:r>
+          </w:p>
+        </w:tc>
+        <w:tc>
+          <w:tcPr/>
+          <w:p>
+            <w:pPr>
+              <w:jc w:val="left"/>
+            </w:pPr>
+            <w:r>
+              <w:t xml:space="preserve">…​</w:t>
+            </w:r>
+          </w:p>
+        </w:tc>
+        <w:tc>
+          <w:tcPr/>
+          <w:p>
+            <w:pPr>
+              <w:jc w:val="left"/>
+            </w:pPr>
+            <w:r>
+              <w:t xml:space="preserve">Not Available</w:t>
+            </w:r>
+          </w:p>
+        </w:tc>
+      </w:tr>
+      <w:tr>
+        <w:tc>
+          <w:tcPr/>
+          <w:p>
+            <w:pPr>
+              <w:jc w:val="left"/>
+            </w:pPr>
+            <w:r>
+              <w:t xml:space="preserve">GB China</w:t>
+            </w:r>
+          </w:p>
+        </w:tc>
+        <w:tc>
+          <w:tcPr>
+            <w:gridSpan w:val="2"/>
+          </w:tcPr>
+          <w:p>
+            <w:pPr>
+              <w:jc w:val="left"/>
+            </w:pPr>
+            <w:r>
+              <w:t xml:space="preserve">From GM China</w:t>
+            </w:r>
+          </w:p>
+        </w:tc>
+        <w:tc>
+          <w:tcPr/>
+          <w:p>
+            <w:pPr>
+              <w:jc w:val="left"/>
+            </w:pPr>
+            <w:r>
+              <w:t xml:space="preserve">68</w:t>
+            </w:r>
+          </w:p>
+        </w:tc>
+        <w:tc>
+          <w:tcPr/>
+          <w:p>
+            <w:pPr>
+              <w:jc w:val="left"/>
+            </w:pPr>
+            <w:r>
+              <w:t xml:space="preserve">…​</w:t>
+            </w:r>
+          </w:p>
+        </w:tc>
+        <w:tc>
+          <w:tcPr/>
+          <w:p>
+            <w:pPr>
+              <w:jc w:val="left"/>
+            </w:pPr>
+            <w:r>
+              <w:t xml:space="preserve">68</w:t>
+            </w:r>
+          </w:p>
+        </w:tc>
+      </w:tr>
+      <w:tr>
+        <w:tc>
+          <w:tcPr/>
+          <w:p>
+            <w:pPr>
+              <w:jc w:val="left"/>
+            </w:pPr>
+            <w:r>
+              <w:t xml:space="preserve">GB China</w:t>
+            </w:r>
+          </w:p>
+        </w:tc>
+        <w:tc>
+          <w:tcPr>
+            <w:gridSpan w:val="2"/>
+          </w:tcPr>
+          <w:p>
+            <w:pPr>
+              <w:jc w:val="left"/>
+            </w:pPr>
+            <w:r>
+              <w:t xml:space="preserve">From GM MAROCMETEA</w:t>
+            </w:r>
+          </w:p>
+        </w:tc>
+        <w:tc>
+          <w:tcPr/>
+          <w:p>
+            <w:pPr>
+              <w:jc w:val="left"/>
+            </w:pPr>
+            <w:r>
+              <w:t xml:space="preserve">68</w:t>
+            </w:r>
+          </w:p>
+        </w:tc>
+        <w:tc>
+          <w:tcPr/>
+          <w:p>
+            <w:pPr>
+              <w:jc w:val="left"/>
+            </w:pPr>
+            <w:r>
+              <w:t xml:space="preserve">…​</w:t>
+            </w:r>
+          </w:p>
+        </w:tc>
+        <w:tc>
+          <w:tcPr/>
+          <w:p>
+            <w:pPr>
+              <w:jc w:val="left"/>
+            </w:pPr>
+            <w:r>
+              <w:t xml:space="preserve">Not Available</w:t>
+            </w:r>
+          </w:p>
+        </w:tc>
+      </w:tr>
+      <w:tr>
+        <w:tc>
+          <w:tcPr/>
+          <w:p>
+            <w:pPr>
+              <w:jc w:val="left"/>
+            </w:pPr>
+            <w:r>
+              <w:t xml:space="preserve">GB France</w:t>
+            </w:r>
+          </w:p>
+        </w:tc>
+        <w:tc>
+          <w:tcPr>
+            <w:gridSpan w:val="2"/>
+          </w:tcPr>
+          <w:p>
+            <w:pPr>
+              <w:jc w:val="left"/>
+            </w:pPr>
+            <w:r>
+              <w:t xml:space="preserve">From GM China</w:t>
+            </w:r>
+          </w:p>
+        </w:tc>
+        <w:tc>
+          <w:tcPr/>
+          <w:p>
+            <w:pPr>
+              <w:jc w:val="left"/>
+            </w:pPr>
+            <w:r>
+              <w:t xml:space="preserve">62</w:t>
+            </w:r>
+          </w:p>
+        </w:tc>
+        <w:tc>
+          <w:tcPr/>
+          <w:p>
+            <w:pPr>
+              <w:jc w:val="left"/>
+            </w:pPr>
+            <w:r>
+              <w:t xml:space="preserve">…​</w:t>
+            </w:r>
+          </w:p>
+        </w:tc>
+        <w:tc>
+          <w:tcPr/>
+          <w:p>
+            <w:pPr>
+              <w:jc w:val="left"/>
+            </w:pPr>
+            <w:r>
+              <w:t xml:space="preserve">63</w:t>
+            </w:r>
+          </w:p>
+        </w:tc>
+      </w:tr>
+      <w:tr>
+        <w:tc>
+          <w:tcPr/>
+          <w:p>
+            <w:pPr>
+              <w:jc w:val="left"/>
+            </w:pPr>
+            <w:r>
+              <w:t xml:space="preserve">GB France</w:t>
+            </w:r>
+          </w:p>
+        </w:tc>
+        <w:tc>
+          <w:tcPr>
+            <w:gridSpan w:val="2"/>
+          </w:tcPr>
+          <w:p>
+            <w:pPr>
+              <w:jc w:val="left"/>
+            </w:pPr>
+            <w:r>
+              <w:t xml:space="preserve">From GM MAROCMETEA</w:t>
+            </w:r>
+          </w:p>
+        </w:tc>
+        <w:tc>
+          <w:tcPr/>
+          <w:p>
+            <w:pPr>
+              <w:jc w:val="left"/>
+            </w:pPr>
+            <w:r>
+              <w:t xml:space="preserve">62</w:t>
+            </w:r>
+          </w:p>
+        </w:tc>
+        <w:tc>
+          <w:tcPr/>
+          <w:p>
+            <w:pPr>
+              <w:jc w:val="left"/>
+            </w:pPr>
+            <w:r>
+              <w:t xml:space="preserve">…​</w:t>
+            </w:r>
+          </w:p>
+        </w:tc>
+        <w:tc>
+          <w:tcPr/>
+          <w:p>
+            <w:pPr>
+              <w:jc w:val="left"/>
+            </w:pPr>
+            <w:r>
+              <w:t xml:space="preserve">Not Available</w:t>
+            </w:r>
+          </w:p>
+        </w:tc>
+      </w:tr>
+      <w:tr>
+        <w:tc>
+          <w:tcPr/>
+          <w:p>
+            <w:pPr>
+              <w:jc w:val="left"/>
+            </w:pPr>
+            <w:r>
+              <w:t xml:space="preserve">GB USA</w:t>
+            </w:r>
+          </w:p>
+        </w:tc>
+        <w:tc>
+          <w:tcPr>
+            <w:gridSpan w:val="2"/>
+          </w:tcPr>
+          <w:p>
+            <w:pPr>
+              <w:jc w:val="left"/>
+            </w:pPr>
+            <w:r>
+              <w:t xml:space="preserve">From GM China</w:t>
+            </w:r>
+          </w:p>
+        </w:tc>
+        <w:tc>
+          <w:tcPr/>
+          <w:p>
+            <w:pPr>
+              <w:jc w:val="left"/>
+            </w:pPr>
+            <w:r>
+              <w:t xml:space="preserve">46</w:t>
+            </w:r>
+          </w:p>
+        </w:tc>
+        <w:tc>
+          <w:tcPr/>
+          <w:p>
+            <w:pPr>
+              <w:jc w:val="left"/>
+            </w:pPr>
+            <w:r>
+              <w:t xml:space="preserve">…​</w:t>
+            </w:r>
+          </w:p>
+        </w:tc>
+        <w:tc>
+          <w:tcPr/>
+          <w:p>
+            <w:pPr>
+              <w:jc w:val="left"/>
+            </w:pPr>
+            <w:r>
+              <w:t xml:space="preserve">52</w:t>
+            </w:r>
+          </w:p>
+        </w:tc>
+      </w:tr>
+      <w:tr>
+        <w:tc>
+          <w:tcPr/>
+          <w:p>
+            <w:pPr>
+              <w:jc w:val="left"/>
+            </w:pPr>
+            <w:r>
+              <w:t xml:space="preserve">GB USA</w:t>
+            </w:r>
+          </w:p>
+        </w:tc>
+        <w:tc>
+          <w:tcPr>
+            <w:gridSpan w:val="2"/>
+          </w:tcPr>
+          <w:p>
+            <w:pPr>
+              <w:jc w:val="left"/>
+            </w:pPr>
+            <w:r>
+              <w:t xml:space="preserve">From GM MAROCMETEA</w:t>
+            </w:r>
+          </w:p>
+        </w:tc>
+        <w:tc>
+          <w:tcPr/>
+          <w:p>
+            <w:pPr>
+              <w:jc w:val="left"/>
+            </w:pPr>
+            <w:r>
+              <w:t xml:space="preserve">46</w:t>
+            </w:r>
+          </w:p>
+        </w:tc>
+        <w:tc>
+          <w:tcPr/>
+          <w:p>
+            <w:pPr>
+              <w:jc w:val="left"/>
+            </w:pPr>
+            <w:r>
+              <w:t xml:space="preserve">…​</w:t>
+            </w:r>
+          </w:p>
+        </w:tc>
+        <w:tc>
+          <w:tcPr/>
+          <w:p>
+            <w:pPr>
+              <w:jc w:val="left"/>
+            </w:pPr>
+            <w:r>
+              <w:t xml:space="preserve">Not Available</w:t>
+            </w:r>
+          </w:p>
+        </w:tc>
+      </w:tr>
+      <w:tr>
+        <w:tc>
+          <w:tcPr>
+            <w:gridSpan w:val="3"/>
+          </w:tcPr>
+          <w:p>
+            <w:pPr>
+              <w:jc w:val="left"/>
+            </w:pPr>
+            <w:r>
+              <w:rPr>
+                <w:bCs/>
+                <w:b/>
+              </w:rPr>
+              <w:t xml:space="preserve">Global Caches</w:t>
+            </w:r>
+          </w:p>
+        </w:tc>
+        <w:tc>
+          <w:tcPr/>
+          <w:p>
+            <w:pPr>
+              <w:pStyle w:val="Compact"/>
+            </w:pPr>
+          </w:p>
+        </w:tc>
+        <w:tc>
+          <w:tcPr/>
+          <w:p>
+            <w:pPr>
+              <w:pStyle w:val="Compact"/>
+            </w:pPr>
+          </w:p>
+        </w:tc>
+        <w:tc>
+          <w:tcPr/>
+          <w:p>
+            <w:pPr>
+              <w:pStyle w:val="Compact"/>
+            </w:pPr>
+          </w:p>
+        </w:tc>
+      </w:tr>
+      <w:tr>
+        <w:tc>
+          <w:tcPr>
+            <w:gridSpan w:val="3"/>
+          </w:tcPr>
+          <w:p>
+            <w:pPr>
+              <w:jc w:val="left"/>
+            </w:pPr>
+            <w:r>
+              <w:t xml:space="preserve">Based on dashboard</w:t>
+            </w:r>
+            <w:r>
+              <w:t xml:space="preserve"> </w:t>
+            </w:r>
+            <w:r>
+              <w:rPr>
+                <w:bCs/>
+                <w:b/>
+              </w:rPr>
+              <w:t xml:space="preserve">WIS2-GISC/wis2-gisc-GC</w:t>
+            </w:r>
+            <w:r>
+              <w:t xml:space="preserve"> </w:t>
+            </w:r>
+            <w:r>
+              <w:t xml:space="preserve">(gisc_user) / Indicator: "WIS2Nodes Total downloaded over past 24h"</w:t>
+            </w:r>
+          </w:p>
+        </w:tc>
+        <w:tc>
+          <w:tcPr/>
+          <w:p>
+            <w:pPr>
+              <w:jc w:val="left"/>
+            </w:pPr>
+            <w:r>
+              <w:t xml:space="preserve">YYYY/MM/DD</w:t>
+            </w:r>
+          </w:p>
+        </w:tc>
+        <w:tc>
+          <w:tcPr/>
+          <w:p>
+            <w:pPr>
+              <w:jc w:val="left"/>
+            </w:pPr>
+            <w:r>
+              <w:t xml:space="preserve">…​</w:t>
+            </w:r>
+          </w:p>
+        </w:tc>
+        <w:tc>
+          <w:tcPr/>
+          <w:p>
+            <w:pPr>
+              <w:jc w:val="left"/>
+            </w:pPr>
+            <w:r>
+              <w:t xml:space="preserve">YYYY/MM/DD</w:t>
+            </w:r>
+          </w:p>
+        </w:tc>
+      </w:tr>
+      <w:tr>
+        <w:tc>
+          <w:tcPr/>
+          <w:p>
+            <w:pPr>
+              <w:jc w:val="left"/>
+            </w:pPr>
+            <w:r>
+              <w:t xml:space="preserve">GC CN CMA</w:t>
+            </w:r>
+          </w:p>
+        </w:tc>
+        <w:tc>
+          <w:tcPr>
+            <w:gridSpan w:val="2"/>
+          </w:tcPr>
+          <w:p>
+            <w:pPr>
+              <w:jc w:val="left"/>
+            </w:pPr>
+            <w:r>
+              <w:t xml:space="preserve">From GM China</w:t>
+            </w:r>
+          </w:p>
+        </w:tc>
+        <w:tc>
+          <w:tcPr/>
+          <w:p>
+            <w:pPr>
+              <w:jc w:val="left"/>
+            </w:pPr>
+            <w:r>
+              <w:t xml:space="preserve">No data</w:t>
+            </w:r>
+          </w:p>
+        </w:tc>
+        <w:tc>
+          <w:tcPr/>
+          <w:p>
+            <w:pPr>
+              <w:jc w:val="left"/>
+            </w:pPr>
+            <w:r>
+              <w:t xml:space="preserve">…​</w:t>
+            </w:r>
+          </w:p>
+        </w:tc>
+        <w:tc>
+          <w:tcPr/>
+          <w:p>
+            <w:pPr>
+              <w:jc w:val="left"/>
+            </w:pPr>
+            <w:r>
+              <w:t xml:space="preserve">No data</w:t>
+            </w:r>
+          </w:p>
+        </w:tc>
+      </w:tr>
+      <w:tr>
+        <w:tc>
+          <w:tcPr/>
+          <w:p>
+            <w:pPr>
+              <w:jc w:val="left"/>
+            </w:pPr>
+            <w:r>
+              <w:t xml:space="preserve">GB CN CMA</w:t>
+            </w:r>
+          </w:p>
+        </w:tc>
+        <w:tc>
+          <w:tcPr>
+            <w:gridSpan w:val="2"/>
+          </w:tcPr>
+          <w:p>
+            <w:pPr>
+              <w:jc w:val="left"/>
+            </w:pPr>
+            <w:r>
+              <w:t xml:space="preserve">From GM MAROCMETEA</w:t>
+            </w:r>
+          </w:p>
+        </w:tc>
+        <w:tc>
+          <w:tcPr/>
+          <w:p>
+            <w:pPr>
+              <w:jc w:val="left"/>
+            </w:pPr>
+            <w:r>
+              <w:t xml:space="preserve">No data</w:t>
+            </w:r>
+          </w:p>
+        </w:tc>
+        <w:tc>
+          <w:tcPr/>
+          <w:p>
+            <w:pPr>
+              <w:jc w:val="left"/>
+            </w:pPr>
+            <w:r>
+              <w:t xml:space="preserve">…​</w:t>
+            </w:r>
+          </w:p>
+        </w:tc>
+        <w:tc>
+          <w:tcPr/>
+          <w:p>
+            <w:pPr>
+              <w:jc w:val="left"/>
+            </w:pPr>
+            <w:r>
+              <w:t xml:space="preserve">No data</w:t>
+            </w:r>
+          </w:p>
+        </w:tc>
+      </w:tr>
+      <w:tr>
+        <w:tc>
+          <w:tcPr/>
+          <w:p>
+            <w:pPr>
+              <w:jc w:val="left"/>
+            </w:pPr>
+            <w:r>
+              <w:t xml:space="preserve">GC MO NOAA US/UK</w:t>
+            </w:r>
+          </w:p>
+        </w:tc>
+        <w:tc>
+          <w:tcPr>
+            <w:gridSpan w:val="2"/>
+          </w:tcPr>
+          <w:p>
+            <w:pPr>
+              <w:jc w:val="left"/>
+            </w:pPr>
+            <w:r>
+              <w:t xml:space="preserve">From GM China</w:t>
+            </w:r>
+          </w:p>
+        </w:tc>
+        <w:tc>
+          <w:tcPr/>
+          <w:p>
+            <w:pPr>
+              <w:jc w:val="left"/>
+            </w:pPr>
+            <w:r>
+              <w:t xml:space="preserve">58</w:t>
+            </w:r>
+          </w:p>
+        </w:tc>
+        <w:tc>
+          <w:tcPr/>
+          <w:p>
+            <w:pPr>
+              <w:jc w:val="left"/>
+            </w:pPr>
+            <w:r>
+              <w:t xml:space="preserve">…​</w:t>
+            </w:r>
+          </w:p>
+        </w:tc>
+        <w:tc>
+          <w:tcPr/>
+          <w:p>
+            <w:pPr>
+              <w:jc w:val="left"/>
+            </w:pPr>
+            <w:r>
+              <w:t xml:space="preserve">58</w:t>
+            </w:r>
+          </w:p>
+        </w:tc>
+      </w:tr>
+      <w:tr>
+        <w:tc>
+          <w:tcPr/>
+          <w:p>
+            <w:pPr>
+              <w:jc w:val="left"/>
+            </w:pPr>
+            <w:r>
+              <w:t xml:space="preserve">GB MO NOAA US/UK</w:t>
+            </w:r>
+          </w:p>
+        </w:tc>
+        <w:tc>
+          <w:tcPr>
+            <w:gridSpan w:val="2"/>
+          </w:tcPr>
+          <w:p>
+            <w:pPr>
+              <w:jc w:val="left"/>
+            </w:pPr>
+            <w:r>
+              <w:t xml:space="preserve">From GM MAROCMETEA</w:t>
+            </w:r>
+          </w:p>
+        </w:tc>
+        <w:tc>
+          <w:tcPr/>
+          <w:p>
+            <w:pPr>
+              <w:jc w:val="left"/>
+            </w:pPr>
+            <w:r>
+              <w:t xml:space="preserve">58</w:t>
+            </w:r>
+          </w:p>
+        </w:tc>
+        <w:tc>
+          <w:tcPr/>
+          <w:p>
+            <w:pPr>
+              <w:jc w:val="left"/>
+            </w:pPr>
+            <w:r>
+              <w:t xml:space="preserve">…​</w:t>
+            </w:r>
+          </w:p>
+        </w:tc>
+        <w:tc>
+          <w:tcPr/>
+          <w:p>
+            <w:pPr>
+              <w:jc w:val="left"/>
+            </w:pPr>
+            <w:r>
+              <w:t xml:space="preserve">58</w:t>
+            </w:r>
+          </w:p>
+        </w:tc>
+      </w:tr>
+      <w:tr>
+        <w:tc>
+          <w:tcPr/>
+          <w:p>
+            <w:pPr>
+              <w:jc w:val="left"/>
+            </w:pPr>
+            <w:r>
+              <w:t xml:space="preserve">GC DE DWD</w:t>
+            </w:r>
+          </w:p>
+        </w:tc>
+        <w:tc>
+          <w:tcPr>
+            <w:gridSpan w:val="2"/>
+          </w:tcPr>
+          <w:p>
+            <w:pPr>
+              <w:jc w:val="left"/>
+            </w:pPr>
+            <w:r>
+              <w:t xml:space="preserve">From GM China</w:t>
+            </w:r>
+          </w:p>
+        </w:tc>
+        <w:tc>
+          <w:tcPr/>
+          <w:p>
+            <w:pPr>
+              <w:jc w:val="left"/>
+            </w:pPr>
+            <w:r>
+              <w:t xml:space="preserve">56</w:t>
+            </w:r>
+          </w:p>
+        </w:tc>
+        <w:tc>
+          <w:tcPr/>
+          <w:p>
+            <w:pPr>
+              <w:jc w:val="left"/>
+            </w:pPr>
+            <w:r>
+              <w:t xml:space="preserve">…​</w:t>
+            </w:r>
+          </w:p>
+        </w:tc>
+        <w:tc>
+          <w:tcPr/>
+          <w:p>
+            <w:pPr>
+              <w:jc w:val="left"/>
+            </w:pPr>
+            <w:r>
+              <w:t xml:space="preserve">58</w:t>
+            </w:r>
+          </w:p>
+        </w:tc>
+      </w:tr>
+      <w:tr>
+        <w:tc>
+          <w:tcPr/>
+          <w:p>
+            <w:pPr>
+              <w:jc w:val="left"/>
+            </w:pPr>
+            <w:r>
+              <w:t xml:space="preserve">GB DE DWD</w:t>
+            </w:r>
+          </w:p>
+        </w:tc>
+        <w:tc>
+          <w:tcPr>
+            <w:gridSpan w:val="2"/>
+          </w:tcPr>
+          <w:p>
+            <w:pPr>
+              <w:jc w:val="left"/>
+            </w:pPr>
+            <w:r>
+              <w:t xml:space="preserve">From GM MAROCMETEA</w:t>
+            </w:r>
+          </w:p>
+        </w:tc>
+        <w:tc>
+          <w:tcPr/>
+          <w:p>
+            <w:pPr>
+              <w:jc w:val="left"/>
+            </w:pPr>
+            <w:r>
+              <w:t xml:space="preserve">56</w:t>
+            </w:r>
+          </w:p>
+        </w:tc>
+        <w:tc>
+          <w:tcPr/>
+          <w:p>
+            <w:pPr>
+              <w:jc w:val="left"/>
+            </w:pPr>
+            <w:r>
+              <w:t xml:space="preserve">…​</w:t>
+            </w:r>
+          </w:p>
+        </w:tc>
+        <w:tc>
+          <w:tcPr/>
+          <w:p>
+            <w:pPr>
+              <w:jc w:val="left"/>
+            </w:pPr>
+            <w:r>
+              <w:t xml:space="preserve">58</w:t>
+            </w:r>
+          </w:p>
+        </w:tc>
+      </w:tr>
+      <w:tr>
+        <w:tc>
+          <w:tcPr/>
+          <w:p>
+            <w:pPr>
+              <w:jc w:val="left"/>
+            </w:pPr>
+            <w:r>
+              <w:t xml:space="preserve">GC JP JMA</w:t>
+            </w:r>
+          </w:p>
+        </w:tc>
+        <w:tc>
+          <w:tcPr>
+            <w:gridSpan w:val="2"/>
+          </w:tcPr>
+          <w:p>
+            <w:pPr>
+              <w:jc w:val="left"/>
+            </w:pPr>
+            <w:r>
+              <w:t xml:space="preserve">From GM China</w:t>
+            </w:r>
+          </w:p>
+        </w:tc>
+        <w:tc>
+          <w:tcPr/>
+          <w:p>
+            <w:pPr>
+              <w:jc w:val="left"/>
+            </w:pPr>
+            <w:r>
+              <w:t xml:space="preserve">57</w:t>
+            </w:r>
+          </w:p>
+        </w:tc>
+        <w:tc>
+          <w:tcPr/>
+          <w:p>
+            <w:pPr>
+              <w:jc w:val="left"/>
+            </w:pPr>
+            <w:r>
+              <w:t xml:space="preserve">…​</w:t>
+            </w:r>
+          </w:p>
+        </w:tc>
+        <w:tc>
+          <w:tcPr/>
+          <w:p>
+            <w:pPr>
+              <w:jc w:val="left"/>
+            </w:pPr>
+            <w:r>
+              <w:t xml:space="preserve">58</w:t>
+            </w:r>
+          </w:p>
+        </w:tc>
+      </w:tr>
+      <w:tr>
+        <w:tc>
+          <w:tcPr/>
+          <w:p>
+            <w:pPr>
+              <w:jc w:val="left"/>
+            </w:pPr>
+            <w:r>
+              <w:t xml:space="preserve">GB JP JMA</w:t>
+            </w:r>
+          </w:p>
+        </w:tc>
+        <w:tc>
+          <w:tcPr>
+            <w:gridSpan w:val="2"/>
+          </w:tcPr>
+          <w:p>
+            <w:pPr>
+              <w:jc w:val="left"/>
+            </w:pPr>
+            <w:r>
+              <w:t xml:space="preserve">From GM MAROCMETEA</w:t>
+            </w:r>
+          </w:p>
+        </w:tc>
+        <w:tc>
+          <w:tcPr/>
+          <w:p>
+            <w:pPr>
+              <w:jc w:val="left"/>
+            </w:pPr>
+            <w:r>
+              <w:t xml:space="preserve">57</w:t>
+            </w:r>
+          </w:p>
+        </w:tc>
+        <w:tc>
+          <w:tcPr/>
+          <w:p>
+            <w:pPr>
+              <w:jc w:val="left"/>
+            </w:pPr>
+            <w:r>
+              <w:t xml:space="preserve">…​</w:t>
+            </w:r>
+          </w:p>
+        </w:tc>
+        <w:tc>
+          <w:tcPr/>
+          <w:p>
+            <w:pPr>
+              <w:jc w:val="left"/>
+            </w:pPr>
+            <w:r>
+              <w:t xml:space="preserve">58</w:t>
+            </w:r>
+          </w:p>
+        </w:tc>
+      </w:tr>
+      <w:tr>
+        <w:tc>
+          <w:tcPr/>
+          <w:p>
+            <w:pPr>
+              <w:jc w:val="left"/>
+            </w:pPr>
+            <w:r>
+              <w:t xml:space="preserve">GC SA NCM</w:t>
+            </w:r>
+          </w:p>
+        </w:tc>
+        <w:tc>
+          <w:tcPr>
+            <w:gridSpan w:val="2"/>
+          </w:tcPr>
+          <w:p>
+            <w:pPr>
+              <w:jc w:val="left"/>
+            </w:pPr>
+            <w:r>
+              <w:t xml:space="preserve">From GM China</w:t>
+            </w:r>
+          </w:p>
+        </w:tc>
+        <w:tc>
+          <w:tcPr/>
+          <w:p>
+            <w:pPr>
+              <w:jc w:val="left"/>
+            </w:pPr>
+            <w:r>
+              <w:t xml:space="preserve">No data</w:t>
+            </w:r>
+          </w:p>
+        </w:tc>
+        <w:tc>
+          <w:tcPr/>
+          <w:p>
+            <w:pPr>
+              <w:jc w:val="left"/>
+            </w:pPr>
+            <w:r>
+              <w:t xml:space="preserve">…​</w:t>
+            </w:r>
+          </w:p>
+        </w:tc>
+        <w:tc>
+          <w:tcPr/>
+          <w:p>
+            <w:pPr>
+              <w:jc w:val="left"/>
+            </w:pPr>
+            <w:r>
+              <w:t xml:space="preserve">59</w:t>
+            </w:r>
+          </w:p>
+        </w:tc>
+      </w:tr>
+      <w:tr>
+        <w:tc>
+          <w:tcPr/>
+          <w:p>
+            <w:pPr>
+              <w:jc w:val="left"/>
+            </w:pPr>
+            <w:r>
+              <w:t xml:space="preserve">GB SA NCM</w:t>
+            </w:r>
+          </w:p>
+        </w:tc>
+        <w:tc>
+          <w:tcPr>
+            <w:gridSpan w:val="2"/>
+          </w:tcPr>
+          <w:p>
+            <w:pPr>
+              <w:jc w:val="left"/>
+            </w:pPr>
+            <w:r>
+              <w:t xml:space="preserve">From GM MAROCMETEA</w:t>
+            </w:r>
+          </w:p>
+        </w:tc>
+        <w:tc>
+          <w:tcPr/>
+          <w:p>
+            <w:pPr>
+              <w:jc w:val="left"/>
+            </w:pPr>
+            <w:r>
+              <w:t xml:space="preserve">No data</w:t>
+            </w:r>
+          </w:p>
+        </w:tc>
+        <w:tc>
+          <w:tcPr/>
+          <w:p>
+            <w:pPr>
+              <w:jc w:val="left"/>
+            </w:pPr>
+            <w:r>
+              <w:t xml:space="preserve">…​</w:t>
+            </w:r>
+          </w:p>
+        </w:tc>
+        <w:tc>
+          <w:tcPr/>
+          <w:p>
+            <w:pPr>
+              <w:jc w:val="left"/>
+            </w:pPr>
+            <w:r>
+              <w:t xml:space="preserve">59</w:t>
+            </w:r>
+          </w:p>
+        </w:tc>
+      </w:tr>
+      <w:tr>
+        <w:tc>
+          <w:tcPr>
+            <w:gridSpan w:val="3"/>
+          </w:tcPr>
+          <w:p>
+            <w:pPr>
+              <w:jc w:val="left"/>
+            </w:pPr>
+            <w:r>
+              <w:rPr>
+                <w:bCs/>
+                <w:b/>
+              </w:rPr>
+              <w:t xml:space="preserve">JIRA Ticketing System</w:t>
+            </w:r>
+          </w:p>
+        </w:tc>
+        <w:tc>
+          <w:tcPr/>
+          <w:p>
+            <w:pPr>
+              <w:jc w:val="left"/>
+            </w:pPr>
+            <w:r>
+              <w:t xml:space="preserve">YYYY/MM/DD</w:t>
+            </w:r>
+          </w:p>
+        </w:tc>
+        <w:tc>
+          <w:tcPr/>
+          <w:p>
+            <w:pPr>
+              <w:jc w:val="left"/>
+            </w:pPr>
+            <w:r>
+              <w:t xml:space="preserve">…​</w:t>
+            </w:r>
+          </w:p>
+        </w:tc>
+        <w:tc>
+          <w:tcPr/>
+          <w:p>
+            <w:pPr>
+              <w:jc w:val="left"/>
+            </w:pPr>
+            <w:r>
+              <w:t xml:space="preserve">YYYY/MM/DD</w:t>
+            </w:r>
+          </w:p>
+        </w:tc>
+      </w:tr>
+      <w:tr>
+        <w:tc>
+          <w:tcPr/>
+          <w:p>
+            <w:pPr>
+              <w:jc w:val="left"/>
+            </w:pPr>
+            <w:r>
+              <w:t xml:space="preserve">Total "In Progress"</w:t>
+            </w:r>
+          </w:p>
+        </w:tc>
+        <w:tc>
+          <w:tcPr/>
+          <w:p>
+            <w:pPr>
+              <w:pStyle w:val="Compact"/>
+            </w:pPr>
+          </w:p>
+        </w:tc>
+        <w:tc>
+          <w:tcPr/>
+          <w:p>
+            <w:pPr>
+              <w:pStyle w:val="Compact"/>
+            </w:pPr>
+          </w:p>
+        </w:tc>
+        <w:tc>
+          <w:tcPr/>
+          <w:p>
+            <w:pPr>
+              <w:jc w:val="left"/>
+            </w:pPr>
+            <w:r>
+              <w:t xml:space="preserve">No data</w:t>
+            </w:r>
+          </w:p>
+        </w:tc>
+        <w:tc>
+          <w:tcPr/>
+          <w:p>
+            <w:pPr>
+              <w:jc w:val="left"/>
+            </w:pPr>
+            <w:r>
+              <w:t xml:space="preserve">…​</w:t>
+            </w:r>
+          </w:p>
+        </w:tc>
+        <w:tc>
+          <w:tcPr/>
+          <w:p>
+            <w:pPr>
+              <w:jc w:val="left"/>
+            </w:pPr>
+            <w:r>
+              <w:t xml:space="preserve">2</w:t>
+            </w:r>
+          </w:p>
+        </w:tc>
+      </w:tr>
+      <w:tr>
+        <w:tc>
+          <w:tcPr/>
+          <w:p>
+            <w:pPr>
+              <w:jc w:val="left"/>
+            </w:pPr>
+            <w:r>
+              <w:t xml:space="preserve">Total "To Do"</w:t>
+            </w:r>
+          </w:p>
+        </w:tc>
+        <w:tc>
+          <w:tcPr/>
+          <w:p>
+            <w:pPr>
+              <w:pStyle w:val="Compact"/>
+            </w:pPr>
+          </w:p>
+        </w:tc>
+        <w:tc>
+          <w:tcPr/>
+          <w:p>
+            <w:pPr>
+              <w:pStyle w:val="Compact"/>
+            </w:pPr>
+          </w:p>
+        </w:tc>
+        <w:tc>
+          <w:tcPr/>
+          <w:p>
+            <w:pPr>
+              <w:jc w:val="left"/>
+            </w:pPr>
+            <w:r>
+              <w:t xml:space="preserve">No data</w:t>
+            </w:r>
+          </w:p>
+        </w:tc>
+        <w:tc>
+          <w:tcPr/>
+          <w:p>
+            <w:pPr>
+              <w:jc w:val="left"/>
+            </w:pPr>
+            <w:r>
+              <w:t xml:space="preserve">…​</w:t>
+            </w:r>
+          </w:p>
+        </w:tc>
+        <w:tc>
+          <w:tcPr/>
+          <w:p>
+            <w:pPr>
+              <w:jc w:val="left"/>
+            </w:pPr>
+            <w:r>
+              <w:t xml:space="preserve">2</w:t>
+            </w:r>
+          </w:p>
+        </w:tc>
+      </w:tr>
+      <w:tr>
+        <w:tc>
+          <w:tcPr/>
+          <w:p>
+            <w:pPr>
+              <w:jc w:val="left"/>
+            </w:pPr>
+            <w:r>
+              <w:t xml:space="preserve">Total "Done"</w:t>
+            </w:r>
+          </w:p>
+        </w:tc>
+        <w:tc>
+          <w:tcPr/>
+          <w:p>
+            <w:pPr>
+              <w:pStyle w:val="Compact"/>
+            </w:pPr>
+          </w:p>
+        </w:tc>
+        <w:tc>
+          <w:tcPr/>
+          <w:p>
+            <w:pPr>
+              <w:pStyle w:val="Compact"/>
+            </w:pPr>
+          </w:p>
+        </w:tc>
+        <w:tc>
+          <w:tcPr/>
+          <w:p>
+            <w:pPr>
+              <w:jc w:val="left"/>
+            </w:pPr>
+            <w:r>
+              <w:t xml:space="preserve">No data</w:t>
+            </w:r>
+          </w:p>
+        </w:tc>
+        <w:tc>
+          <w:tcPr/>
+          <w:p>
+            <w:pPr>
+              <w:jc w:val="left"/>
+            </w:pPr>
+            <w:r>
+              <w:t xml:space="preserve">…​</w:t>
+            </w:r>
+          </w:p>
+        </w:tc>
+        <w:tc>
+          <w:tcPr/>
+          <w:p>
+            <w:pPr>
+              <w:jc w:val="left"/>
+            </w:pPr>
+            <w:r>
+              <w:t xml:space="preserve">2</w:t>
+            </w:r>
+          </w:p>
+        </w:tc>
+      </w:tr>
+      <w:tr>
+        <w:tc>
+          <w:tcPr/>
+          <w:p>
+            <w:pPr>
+              <w:jc w:val="left"/>
+            </w:pPr>
+            <w:r>
+              <w:t xml:space="preserve">Total "In Review"</w:t>
+            </w:r>
+          </w:p>
+        </w:tc>
+        <w:tc>
+          <w:tcPr/>
+          <w:p>
+            <w:pPr>
+              <w:pStyle w:val="Compact"/>
+            </w:pPr>
+          </w:p>
+        </w:tc>
+        <w:tc>
+          <w:tcPr/>
+          <w:p>
+            <w:pPr>
+              <w:pStyle w:val="Compact"/>
+            </w:pPr>
+          </w:p>
+        </w:tc>
+        <w:tc>
+          <w:tcPr/>
+          <w:p>
+            <w:pPr>
+              <w:jc w:val="left"/>
+            </w:pPr>
+            <w:r>
+              <w:t xml:space="preserve">No data</w:t>
+            </w:r>
+          </w:p>
+        </w:tc>
+        <w:tc>
+          <w:tcPr/>
+          <w:p>
+            <w:pPr>
+              <w:jc w:val="left"/>
+            </w:pPr>
+            <w:r>
+              <w:t xml:space="preserve">…​</w:t>
+            </w:r>
+          </w:p>
+        </w:tc>
+        <w:tc>
+          <w:tcPr/>
+          <w:p>
+            <w:pPr>
+              <w:jc w:val="left"/>
+            </w:pPr>
+            <w:r>
+              <w:t xml:space="preserve">2</w:t>
+            </w:r>
+          </w:p>
+        </w:tc>
+      </w:tr>
+      <w:tr>
+        <w:tc>
+          <w:tcPr/>
+          <w:p>
+            <w:pPr>
+              <w:jc w:val="left"/>
+            </w:pPr>
+            <w:r>
+              <w:t xml:space="preserve">Total "Triage"</w:t>
+            </w:r>
+          </w:p>
+        </w:tc>
+        <w:tc>
+          <w:tcPr/>
+          <w:p>
+            <w:pPr>
+              <w:jc w:val="left"/>
+            </w:pPr>
+            <w:r>
+              <w:t xml:space="preserve">(should be zero)</w:t>
+            </w:r>
+          </w:p>
+        </w:tc>
+        <w:tc>
+          <w:tcPr/>
+          <w:p>
+            <w:pPr>
+              <w:pStyle w:val="Compact"/>
+            </w:pPr>
+          </w:p>
+        </w:tc>
+        <w:tc>
+          <w:tcPr/>
+          <w:p>
+            <w:pPr>
+              <w:jc w:val="left"/>
+            </w:pPr>
+            <w:r>
+              <w:t xml:space="preserve">No data</w:t>
+            </w:r>
+          </w:p>
+        </w:tc>
+        <w:tc>
+          <w:tcPr/>
+          <w:p>
+            <w:pPr>
+              <w:jc w:val="left"/>
+            </w:pPr>
+            <w:r>
+              <w:t xml:space="preserve">…​</w:t>
+            </w:r>
+          </w:p>
+        </w:tc>
+        <w:tc>
+          <w:tcPr/>
+          <w:p>
+            <w:pPr>
+              <w:jc w:val="left"/>
+            </w:pPr>
+            <w:r>
+              <w:t xml:space="preserve">2</w:t>
+            </w:r>
+          </w:p>
+        </w:tc>
+      </w:tr>
+    </w:tbl>
     <w:p>
       <w:pPr>
         <w:pStyle w:val="BodyText"/>
@@ -471,8 +2476,8 @@
         <w:t xml:space="preserve">Check has to be performed at roster start and roster end. Additional dates can also be added.</w:t>
       </w:r>
     </w:p>
-    <w:bookmarkEnd w:id="23"/>
-    <w:bookmarkStart w:id="25" w:name="X987d45cd9a73f8b40ff026950730b0f1e33d674"/>
+    <w:bookmarkEnd w:id="25"/>
+    <w:bookmarkStart w:id="27" w:name="X987d45cd9a73f8b40ff026950730b0f1e33d674"/>
     <w:p>
       <w:pPr>
         <w:pStyle w:val="Heading1"/>
@@ -491,7 +2496,7 @@
       <w:r>
         <w:t xml:space="preserve"> </w:t>
       </w:r>
-      <w:hyperlink r:id="rId24">
+      <w:hyperlink r:id="rId26">
         <w:r>
           <w:rPr>
             <w:rStyle w:val="Hyperlink"/>
@@ -503,8 +2508,8 @@
         <w:t xml:space="preserve">.</w:t>
       </w:r>
     </w:p>
-    <w:bookmarkEnd w:id="25"/>
-    <w:bookmarkStart w:id="26" w:name="X51773c61b6f2cf386079ff0fb51c7ad176d67d4"/>
+    <w:bookmarkEnd w:id="27"/>
+    <w:bookmarkStart w:id="28" w:name="X51773c61b6f2cf386079ff0fb51c7ad176d67d4"/>
     <w:p>
       <w:pPr>
         <w:pStyle w:val="Heading1"/>
@@ -578,8 +2583,8 @@
         <w:t xml:space="preserve">Most tickets are expected to be created automatically by the GISC Monitoring system</w:t>
       </w:r>
     </w:p>
-    <w:bookmarkEnd w:id="26"/>
-    <w:bookmarkStart w:id="30" w:name="X79b541e1ef64a0b37f86a9f085c18718a348a7e"/>
+    <w:bookmarkEnd w:id="28"/>
+    <w:bookmarkStart w:id="32" w:name="X79b541e1ef64a0b37f86a9f085c18718a348a7e"/>
     <w:p>
       <w:pPr>
         <w:pStyle w:val="Heading1"/>
@@ -609,7 +2614,7 @@
       <w:r>
         <w:t xml:space="preserve"> </w:t>
       </w:r>
-      <w:hyperlink r:id="rId24">
+      <w:hyperlink r:id="rId26">
         <w:r>
           <w:rPr>
             <w:rStyle w:val="Hyperlink"/>
@@ -631,7 +2636,7 @@
       <w:r>
         <w:t xml:space="preserve"> </w:t>
       </w:r>
-      <w:hyperlink r:id="rId27">
+      <w:hyperlink r:id="rId29">
         <w:r>
           <w:rPr>
             <w:rStyle w:val="Hyperlink"/>
@@ -729,7 +2734,7 @@
       <w:r>
         <w:t xml:space="preserve"> </w:t>
       </w:r>
-      <w:hyperlink r:id="rId28">
+      <w:hyperlink r:id="rId30">
         <w:r>
           <w:rPr>
             <w:rStyle w:val="Hyperlink"/>
@@ -776,7 +2781,7 @@
         <w:t xml:space="preserve">Table-1: Priority Levels</w:t>
       </w:r>
     </w:p>
-    <w:bookmarkStart w:id="29" w:name="Xe845f501af92fe026b96fe859d037567317632f"/>
+    <w:bookmarkStart w:id="31" w:name="Xe845f501af92fe026b96fe859d037567317632f"/>
     <w:p>
       <w:pPr>
         <w:pStyle w:val="Heading2"/>
@@ -1174,9 +3179,9 @@
         </w:tc>
       </w:tr>
     </w:tbl>
-    <w:bookmarkEnd w:id="29"/>
-    <w:bookmarkEnd w:id="30"/>
-    <w:bookmarkStart w:id="35" w:name="Xa303eeaef2342a49b90f82500d40be955b57221"/>
+    <w:bookmarkEnd w:id="31"/>
+    <w:bookmarkEnd w:id="32"/>
+    <w:bookmarkStart w:id="37" w:name="Xa303eeaef2342a49b90f82500d40be955b57221"/>
     <w:p>
       <w:pPr>
         <w:pStyle w:val="Heading1"/>
@@ -1185,7 +3190,7 @@
         <w:t xml:space="preserve">PART IV. Procedures for Handover</w:t>
       </w:r>
     </w:p>
-    <w:bookmarkStart w:id="31" w:name="X33552956ff26c37b01aed0b53bd210d9e5ed6c7"/>
+    <w:bookmarkStart w:id="33" w:name="X33552956ff26c37b01aed0b53bd210d9e5ed6c7"/>
     <w:p>
       <w:pPr>
         <w:pStyle w:val="Heading2"/>
@@ -1271,8 +3276,8 @@
         <w:t xml:space="preserve">The purpose is to ensure continuity by splitting the remaining period between the two GISCs if needed.</w:t>
       </w:r>
     </w:p>
-    <w:bookmarkEnd w:id="31"/>
-    <w:bookmarkStart w:id="34" w:name="X05e2b0c81db3a44a7d803a778ca90453dba5d44"/>
+    <w:bookmarkEnd w:id="33"/>
+    <w:bookmarkStart w:id="36" w:name="X05e2b0c81db3a44a7d803a778ca90453dba5d44"/>
     <w:p>
       <w:pPr>
         <w:pStyle w:val="Heading2"/>
@@ -1357,7 +3362,7 @@
       <w:r>
         <w:t xml:space="preserve"> </w:t>
       </w:r>
-      <w:hyperlink r:id="rId32">
+      <w:hyperlink r:id="rId34">
         <w:r>
           <w:rPr>
             <w:rStyle w:val="Hyperlink"/>
@@ -1409,7 +3414,7 @@
       <w:r>
         <w:t xml:space="preserve"> </w:t>
       </w:r>
-      <w:hyperlink r:id="rId33">
+      <w:hyperlink r:id="rId35">
         <w:r>
           <w:rPr>
             <w:rStyle w:val="Hyperlink"/>
@@ -1429,9 +3434,9 @@
         <w:t xml:space="preserve">A sample Handover email</w:t>
       </w:r>
     </w:p>
-    <w:bookmarkEnd w:id="34"/>
-    <w:bookmarkEnd w:id="35"/>
-    <w:bookmarkStart w:id="36" w:name="Xb8428fbc8de5013631c8bb1d079f38e3533a3d7"/>
+    <w:bookmarkEnd w:id="36"/>
+    <w:bookmarkEnd w:id="37"/>
+    <w:bookmarkStart w:id="38" w:name="Xb8428fbc8de5013631c8bb1d079f38e3533a3d7"/>
     <w:p>
       <w:pPr>
         <w:pStyle w:val="Heading1"/>
@@ -1588,8 +3593,8 @@
         <w:t xml:space="preserve">GISC Toulouse</w:t>
       </w:r>
     </w:p>
-    <w:bookmarkEnd w:id="36"/>
-    <w:bookmarkStart w:id="37" w:name="X33672f9d5e02526fe30ce1fd643a1d90de17cbb"/>
+    <w:bookmarkEnd w:id="38"/>
+    <w:bookmarkStart w:id="39" w:name="X33672f9d5e02526fe30ce1fd643a1d90de17cbb"/>
     <w:p>
       <w:pPr>
         <w:pStyle w:val="Heading1"/>
@@ -1606,7 +3611,7 @@
         <w:t xml:space="preserve">For any issue related to GISC Watch that requires escalation, the Chair of ET-WISOP is the first escalation point for all GISCs</w:t>
       </w:r>
     </w:p>
-    <w:bookmarkEnd w:id="37"/>
+    <w:bookmarkEnd w:id="39"/>
     <w:sectPr/>
   </w:body>
 </w:document>

</xml_diff>